<commit_message>
Add tutorial link and instructions for Visual Studio Code in poznamky_hodinam.docx
</commit_message>
<xml_diff>
--- a/Poznamky/poznamky_hodinam.docx
+++ b/Poznamky/poznamky_hodinam.docx
@@ -30,6 +30,9 @@
       </w:pPr>
     </w:p>
     <w:p>
+      <w:pPr>
+        <w:pStyle w:val="Heading2"/>
+      </w:pPr>
       <w:r>
         <w:t>2.7.2026</w:t>
       </w:r>
@@ -73,7 +76,21 @@
         <w:rPr>
           <w:lang w:val="en-US"/>
         </w:rPr>
-        <w:t xml:space="preserve"> na </w:t>
+        <w:t xml:space="preserve"> </w:t>
+      </w:r>
+      <w:proofErr w:type="spellStart"/>
+      <w:r>
+        <w:rPr>
+          <w:lang w:val="en-US"/>
+        </w:rPr>
+        <w:t>na</w:t>
+      </w:r>
+      <w:proofErr w:type="spellEnd"/>
+      <w:r>
+        <w:rPr>
+          <w:lang w:val="en-US"/>
+        </w:rPr>
+        <w:t xml:space="preserve"> </w:t>
       </w:r>
       <w:proofErr w:type="spellStart"/>
       <w:r>
@@ -1716,21 +1733,7 @@
         <w:rPr>
           <w:lang w:val="en-US"/>
         </w:rPr>
-        <w:t xml:space="preserve"> &lt;table</w:t>
-      </w:r>
-      <w:proofErr w:type="gramStart"/>
-      <w:r>
-        <w:rPr>
-          <w:lang w:val="en-US"/>
-        </w:rPr>
-        <w:t>&gt; ,</w:t>
-      </w:r>
-      <w:proofErr w:type="gramEnd"/>
-      <w:r>
-        <w:rPr>
-          <w:lang w:val="en-US"/>
-        </w:rPr>
-        <w:t xml:space="preserve"> &lt;</w:t>
+        <w:t xml:space="preserve"> &lt;table&gt; , &lt;</w:t>
       </w:r>
       <w:proofErr w:type="spellStart"/>
       <w:r>
@@ -2075,21 +2078,7 @@
         <w:rPr>
           <w:lang w:val="en-US"/>
         </w:rPr>
-        <w:t xml:space="preserve"> </w:t>
-      </w:r>
-      <w:proofErr w:type="gramStart"/>
-      <w:r>
-        <w:rPr>
-          <w:lang w:val="en-US"/>
-        </w:rPr>
-        <w:t>a</w:t>
-      </w:r>
-      <w:proofErr w:type="gramEnd"/>
-      <w:r>
-        <w:rPr>
-          <w:lang w:val="en-US"/>
-        </w:rPr>
-        <w:t xml:space="preserve"> </w:t>
+        <w:t xml:space="preserve"> a </w:t>
       </w:r>
       <w:proofErr w:type="spellStart"/>
       <w:r>
@@ -2122,6 +2111,7 @@
           <w:bCs/>
           <w:lang w:val="en-US"/>
         </w:rPr>
+        <w:lastRenderedPageBreak/>
         <w:t xml:space="preserve">Meta </w:t>
       </w:r>
       <w:proofErr w:type="spellStart"/>
@@ -2239,7 +2229,6 @@
         <w:t xml:space="preserve"> </w:t>
       </w:r>
       <w:proofErr w:type="spellStart"/>
-      <w:proofErr w:type="gramStart"/>
       <w:r>
         <w:rPr>
           <w:lang w:val="en-US"/>
@@ -2251,14 +2240,7 @@
         <w:rPr>
           <w:lang w:val="en-US"/>
         </w:rPr>
-        <w:t> .</w:t>
-      </w:r>
-      <w:proofErr w:type="gramEnd"/>
-      <w:r>
-        <w:rPr>
-          <w:lang w:val="en-US"/>
-        </w:rPr>
-        <w:t>  charset</w:t>
+        <w:t> .  charset</w:t>
       </w:r>
     </w:p>
     <w:p/>
@@ -2304,6 +2286,9 @@
       </w:pPr>
     </w:p>
     <w:p>
+      <w:pPr>
+        <w:pStyle w:val="Heading2"/>
+      </w:pPr>
       <w:r>
         <w:t>od 8.9.2026</w:t>
       </w:r>
@@ -2348,6 +2333,9 @@
     <w:p/>
     <w:p>
       <w:r>
+        <w:rPr>
+          <w:noProof/>
+        </w:rPr>
         <w:drawing>
           <wp:inline distT="0" distB="0" distL="0" distR="0" wp14:anchorId="44F86235" wp14:editId="07DC7236">
             <wp:extent cx="4294527" cy="1208346"/>
@@ -2386,8 +2374,59 @@
       </w:r>
     </w:p>
     <w:p/>
+    <w:p>
+      <w:r>
+        <w:t>Pokračuj v čítanie úvodu do príkladu VSC – bod 3</w:t>
+      </w:r>
+    </w:p>
+    <w:p>
+      <w:hyperlink r:id="rId10" w:history="1">
+        <w:r>
+          <w:rPr>
+            <w:rStyle w:val="Hyperlink"/>
+          </w:rPr>
+          <w:t xml:space="preserve">Tutoriál: Začnite s </w:t>
+        </w:r>
+        <w:proofErr w:type="spellStart"/>
+        <w:r>
+          <w:rPr>
+            <w:rStyle w:val="Hyperlink"/>
+          </w:rPr>
+          <w:t>Visual</w:t>
+        </w:r>
+        <w:proofErr w:type="spellEnd"/>
+        <w:r>
+          <w:rPr>
+            <w:rStyle w:val="Hyperlink"/>
+          </w:rPr>
+          <w:t xml:space="preserve"> </w:t>
+        </w:r>
+        <w:proofErr w:type="spellStart"/>
+        <w:r>
+          <w:rPr>
+            <w:rStyle w:val="Hyperlink"/>
+          </w:rPr>
+          <w:t>Studio</w:t>
+        </w:r>
+        <w:proofErr w:type="spellEnd"/>
+        <w:r>
+          <w:rPr>
+            <w:rStyle w:val="Hyperlink"/>
+          </w:rPr>
+          <w:t xml:space="preserve"> </w:t>
+        </w:r>
+        <w:proofErr w:type="spellStart"/>
+        <w:r>
+          <w:rPr>
+            <w:rStyle w:val="Hyperlink"/>
+          </w:rPr>
+          <w:t>Code</w:t>
+        </w:r>
+        <w:proofErr w:type="spellEnd"/>
+      </w:hyperlink>
+    </w:p>
     <w:sectPr>
-      <w:footerReference w:type="default" r:id="rId10"/>
+      <w:footerReference w:type="default" r:id="rId11"/>
       <w:pgSz w:w="12240" w:h="15840"/>
       <w:pgMar w:top="1440" w:right="1440" w:bottom="1440" w:left="1440" w:header="708" w:footer="708" w:gutter="0"/>
       <w:cols w:space="708"/>
@@ -3900,7 +3939,6 @@
   <w:style w:type="character" w:default="1" w:styleId="DefaultParagraphFont">
     <w:name w:val="Default Paragraph Font"/>
     <w:uiPriority w:val="1"/>
-    <w:semiHidden/>
     <w:unhideWhenUsed/>
   </w:style>
   <w:style w:type="table" w:default="1" w:styleId="TableNormal">

</xml_diff>

<commit_message>
Fix typo in instructions for GitHub workspace in poznamky_hodinam.docx
</commit_message>
<xml_diff>
--- a/Poznamky/poznamky_hodinam.docx
+++ b/Poznamky/poznamky_hodinam.docx
@@ -76,21 +76,7 @@
         <w:rPr>
           <w:lang w:val="en-US"/>
         </w:rPr>
-        <w:t xml:space="preserve"> </w:t>
-      </w:r>
-      <w:proofErr w:type="spellStart"/>
-      <w:r>
-        <w:rPr>
-          <w:lang w:val="en-US"/>
-        </w:rPr>
-        <w:t>na</w:t>
-      </w:r>
-      <w:proofErr w:type="spellEnd"/>
-      <w:r>
-        <w:rPr>
-          <w:lang w:val="en-US"/>
-        </w:rPr>
-        <w:t xml:space="preserve"> </w:t>
+        <w:t xml:space="preserve"> na </w:t>
       </w:r>
       <w:proofErr w:type="spellStart"/>
       <w:r>
@@ -2305,11 +2291,9 @@
       <w:r>
         <w:t xml:space="preserve"> ako nový </w:t>
       </w:r>
-      <w:proofErr w:type="spellStart"/>
-      <w:r>
-        <w:t>procovný</w:t>
-      </w:r>
-      <w:proofErr w:type="spellEnd"/>
+      <w:r>
+        <w:t>pracovný</w:t>
+      </w:r>
       <w:r>
         <w:t xml:space="preserve"> priestor, sa objaví informácie pre </w:t>
       </w:r>
@@ -3939,6 +3923,7 @@
   <w:style w:type="character" w:default="1" w:styleId="DefaultParagraphFont">
     <w:name w:val="Default Paragraph Font"/>
     <w:uiPriority w:val="1"/>
+    <w:semiHidden/>
     <w:unhideWhenUsed/>
   </w:style>
   <w:style w:type="table" w:default="1" w:styleId="TableNormal">

</xml_diff>